<commit_message>
Simplify commercial proposal section — remove cost breakdown, show single total
Co-authored-by: Adnan Arshad <Adnan2511@users.noreply.github.com>
</commit_message>
<xml_diff>
--- a/documents/Codevelix_Final_Quotation_Zeenat_Pret.docx
+++ b/documents/Codevelix_Final_Quotation_Zeenat_Pret.docx
@@ -1917,6 +1917,11 @@
         <w:t>6.1 One-Time Implementation Investment</w:t>
       </w:r>
     </w:p>
+    <w:p>
+      <w:r>
+        <w:t>Codevelix offers a complete end-to-end implementation of the integrated ERP and Manufacturing Management System as defined in Section 3 of this quotation. The investment covers all modules, integrations, data migration, training, and go-live support.</w:t>
+      </w:r>
+    </w:p>
     <w:tbl>
       <w:tblPr>
         <w:tblStyle w:val="TableGrid"/>
@@ -1924,15 +1929,13 @@
         <w:tblLook w:firstColumn="1" w:firstRow="1" w:lastColumn="0" w:lastRow="0" w:noHBand="0" w:noVBand="1" w:val="04A0"/>
       </w:tblPr>
       <w:tblGrid>
-        <w:gridCol w:w="2448"/>
-        <w:gridCol w:w="2448"/>
-        <w:gridCol w:w="2448"/>
-        <w:gridCol w:w="2448"/>
+        <w:gridCol w:w="4896"/>
+        <w:gridCol w:w="4896"/>
       </w:tblGrid>
       <w:tr>
         <w:tc>
           <w:tcPr>
-            <w:tcW w:type="dxa" w:w="2448"/>
+            <w:tcW w:type="dxa" w:w="4896"/>
             <w:shd w:fill="1A365D" w:val="clear"/>
           </w:tcPr>
           <w:p>
@@ -1942,45 +1945,13 @@
                 <w:color w:val="FFFFFF"/>
                 <w:sz w:val="20"/>
               </w:rPr>
-              <w:t>Component</w:t>
+              <w:t>Description</w:t>
             </w:r>
           </w:p>
         </w:tc>
         <w:tc>
           <w:tcPr>
-            <w:tcW w:type="dxa" w:w="2448"/>
-            <w:shd w:fill="1A365D" w:val="clear"/>
-          </w:tcPr>
-          <w:p>
-            <w:r>
-              <w:rPr>
-                <w:b/>
-                <w:color w:val="FFFFFF"/>
-                <w:sz w:val="20"/>
-              </w:rPr>
-              <w:t>Qty</w:t>
-            </w:r>
-          </w:p>
-        </w:tc>
-        <w:tc>
-          <w:tcPr>
-            <w:tcW w:type="dxa" w:w="2448"/>
-            <w:shd w:fill="1A365D" w:val="clear"/>
-          </w:tcPr>
-          <w:p>
-            <w:r>
-              <w:rPr>
-                <w:b/>
-                <w:color w:val="FFFFFF"/>
-                <w:sz w:val="20"/>
-              </w:rPr>
-              <w:t>Rate (PKR)</w:t>
-            </w:r>
-          </w:p>
-        </w:tc>
-        <w:tc>
-          <w:tcPr>
-            <w:tcW w:type="dxa" w:w="2448"/>
+            <w:tcW w:type="dxa" w:w="4896"/>
             <w:shd w:fill="1A365D" w:val="clear"/>
           </w:tcPr>
           <w:p>
@@ -1998,657 +1969,7 @@
       <w:tr>
         <w:tc>
           <w:tcPr>
-            <w:tcW w:type="dxa" w:w="2448"/>
-          </w:tcPr>
-          <w:p>
-            <w:r>
-              <w:rPr>
-                <w:sz w:val="18"/>
-              </w:rPr>
-              <w:t>Core Platform — Users, Roles, Security &amp; Approvals</w:t>
-            </w:r>
-          </w:p>
-        </w:tc>
-        <w:tc>
-          <w:tcPr>
-            <w:tcW w:type="dxa" w:w="2448"/>
-          </w:tcPr>
-          <w:p>
-            <w:r>
-              <w:rPr>
-                <w:sz w:val="18"/>
-              </w:rPr>
-              <w:t>1</w:t>
-            </w:r>
-          </w:p>
-        </w:tc>
-        <w:tc>
-          <w:tcPr>
-            <w:tcW w:type="dxa" w:w="2448"/>
-          </w:tcPr>
-          <w:p>
-            <w:r>
-              <w:rPr>
-                <w:sz w:val="18"/>
-              </w:rPr>
-              <w:t>50,000</w:t>
-            </w:r>
-          </w:p>
-        </w:tc>
-        <w:tc>
-          <w:tcPr>
-            <w:tcW w:type="dxa" w:w="2448"/>
-          </w:tcPr>
-          <w:p>
-            <w:r>
-              <w:rPr>
-                <w:sz w:val="18"/>
-              </w:rPr>
-              <w:t>50,000</w:t>
-            </w:r>
-          </w:p>
-        </w:tc>
-      </w:tr>
-      <w:tr>
-        <w:tc>
-          <w:tcPr>
-            <w:tcW w:type="dxa" w:w="2448"/>
-          </w:tcPr>
-          <w:p>
-            <w:r>
-              <w:rPr>
-                <w:sz w:val="18"/>
-              </w:rPr>
-              <w:t>HR, Attendance &amp; Payroll Module</w:t>
-            </w:r>
-          </w:p>
-        </w:tc>
-        <w:tc>
-          <w:tcPr>
-            <w:tcW w:type="dxa" w:w="2448"/>
-          </w:tcPr>
-          <w:p>
-            <w:r>
-              <w:rPr>
-                <w:sz w:val="18"/>
-              </w:rPr>
-              <w:t>1</w:t>
-            </w:r>
-          </w:p>
-        </w:tc>
-        <w:tc>
-          <w:tcPr>
-            <w:tcW w:type="dxa" w:w="2448"/>
-          </w:tcPr>
-          <w:p>
-            <w:r>
-              <w:rPr>
-                <w:sz w:val="18"/>
-              </w:rPr>
-              <w:t>105,000</w:t>
-            </w:r>
-          </w:p>
-        </w:tc>
-        <w:tc>
-          <w:tcPr>
-            <w:tcW w:type="dxa" w:w="2448"/>
-          </w:tcPr>
-          <w:p>
-            <w:r>
-              <w:rPr>
-                <w:sz w:val="18"/>
-              </w:rPr>
-              <w:t>105,000</w:t>
-            </w:r>
-          </w:p>
-        </w:tc>
-      </w:tr>
-      <w:tr>
-        <w:tc>
-          <w:tcPr>
-            <w:tcW w:type="dxa" w:w="2448"/>
-          </w:tcPr>
-          <w:p>
-            <w:r>
-              <w:rPr>
-                <w:sz w:val="18"/>
-              </w:rPr>
-              <w:t>Purchase &amp; Procurement Module</w:t>
-            </w:r>
-          </w:p>
-        </w:tc>
-        <w:tc>
-          <w:tcPr>
-            <w:tcW w:type="dxa" w:w="2448"/>
-          </w:tcPr>
-          <w:p>
-            <w:r>
-              <w:rPr>
-                <w:sz w:val="18"/>
-              </w:rPr>
-              <w:t>1</w:t>
-            </w:r>
-          </w:p>
-        </w:tc>
-        <w:tc>
-          <w:tcPr>
-            <w:tcW w:type="dxa" w:w="2448"/>
-          </w:tcPr>
-          <w:p>
-            <w:r>
-              <w:rPr>
-                <w:sz w:val="18"/>
-              </w:rPr>
-              <w:t>75,000</w:t>
-            </w:r>
-          </w:p>
-        </w:tc>
-        <w:tc>
-          <w:tcPr>
-            <w:tcW w:type="dxa" w:w="2448"/>
-          </w:tcPr>
-          <w:p>
-            <w:r>
-              <w:rPr>
-                <w:sz w:val="18"/>
-              </w:rPr>
-              <w:t>75,000</w:t>
-            </w:r>
-          </w:p>
-        </w:tc>
-      </w:tr>
-      <w:tr>
-        <w:tc>
-          <w:tcPr>
-            <w:tcW w:type="dxa" w:w="2448"/>
-          </w:tcPr>
-          <w:p>
-            <w:r>
-              <w:rPr>
-                <w:sz w:val="18"/>
-              </w:rPr>
-              <w:t>Inventory, Warehouse &amp; Stock Management</w:t>
-            </w:r>
-          </w:p>
-        </w:tc>
-        <w:tc>
-          <w:tcPr>
-            <w:tcW w:type="dxa" w:w="2448"/>
-          </w:tcPr>
-          <w:p>
-            <w:r>
-              <w:rPr>
-                <w:sz w:val="18"/>
-              </w:rPr>
-              <w:t>1</w:t>
-            </w:r>
-          </w:p>
-        </w:tc>
-        <w:tc>
-          <w:tcPr>
-            <w:tcW w:type="dxa" w:w="2448"/>
-          </w:tcPr>
-          <w:p>
-            <w:r>
-              <w:rPr>
-                <w:sz w:val="18"/>
-              </w:rPr>
-              <w:t>85,000</w:t>
-            </w:r>
-          </w:p>
-        </w:tc>
-        <w:tc>
-          <w:tcPr>
-            <w:tcW w:type="dxa" w:w="2448"/>
-          </w:tcPr>
-          <w:p>
-            <w:r>
-              <w:rPr>
-                <w:sz w:val="18"/>
-              </w:rPr>
-              <w:t>85,000</w:t>
-            </w:r>
-          </w:p>
-        </w:tc>
-      </w:tr>
-      <w:tr>
-        <w:tc>
-          <w:tcPr>
-            <w:tcW w:type="dxa" w:w="2448"/>
-          </w:tcPr>
-          <w:p>
-            <w:r>
-              <w:rPr>
-                <w:sz w:val="18"/>
-              </w:rPr>
-              <w:t>Production &amp; Manufacturing</w:t>
-              <w:br/>
-              <w:t>(Job Card, Embroidery, Workflow, Costing, Dashboard)</w:t>
-            </w:r>
-          </w:p>
-        </w:tc>
-        <w:tc>
-          <w:tcPr>
-            <w:tcW w:type="dxa" w:w="2448"/>
-          </w:tcPr>
-          <w:p>
-            <w:r>
-              <w:rPr>
-                <w:sz w:val="18"/>
-              </w:rPr>
-              <w:t>1</w:t>
-            </w:r>
-          </w:p>
-        </w:tc>
-        <w:tc>
-          <w:tcPr>
-            <w:tcW w:type="dxa" w:w="2448"/>
-          </w:tcPr>
-          <w:p>
-            <w:r>
-              <w:rPr>
-                <w:sz w:val="18"/>
-              </w:rPr>
-              <w:t>170,000</w:t>
-            </w:r>
-          </w:p>
-        </w:tc>
-        <w:tc>
-          <w:tcPr>
-            <w:tcW w:type="dxa" w:w="2448"/>
-          </w:tcPr>
-          <w:p>
-            <w:r>
-              <w:rPr>
-                <w:sz w:val="18"/>
-              </w:rPr>
-              <w:t>170,000</w:t>
-            </w:r>
-          </w:p>
-        </w:tc>
-      </w:tr>
-      <w:tr>
-        <w:tc>
-          <w:tcPr>
-            <w:tcW w:type="dxa" w:w="2448"/>
-          </w:tcPr>
-          <w:p>
-            <w:r>
-              <w:rPr>
-                <w:sz w:val="18"/>
-              </w:rPr>
-              <w:t>Accounts, Finance &amp; Reconciliation</w:t>
-            </w:r>
-          </w:p>
-        </w:tc>
-        <w:tc>
-          <w:tcPr>
-            <w:tcW w:type="dxa" w:w="2448"/>
-          </w:tcPr>
-          <w:p>
-            <w:r>
-              <w:rPr>
-                <w:sz w:val="18"/>
-              </w:rPr>
-              <w:t>1</w:t>
-            </w:r>
-          </w:p>
-        </w:tc>
-        <w:tc>
-          <w:tcPr>
-            <w:tcW w:type="dxa" w:w="2448"/>
-          </w:tcPr>
-          <w:p>
-            <w:r>
-              <w:rPr>
-                <w:sz w:val="18"/>
-              </w:rPr>
-              <w:t>95,000</w:t>
-            </w:r>
-          </w:p>
-        </w:tc>
-        <w:tc>
-          <w:tcPr>
-            <w:tcW w:type="dxa" w:w="2448"/>
-          </w:tcPr>
-          <w:p>
-            <w:r>
-              <w:rPr>
-                <w:sz w:val="18"/>
-              </w:rPr>
-              <w:t>95,000</w:t>
-            </w:r>
-          </w:p>
-        </w:tc>
-      </w:tr>
-      <w:tr>
-        <w:tc>
-          <w:tcPr>
-            <w:tcW w:type="dxa" w:w="2448"/>
-          </w:tcPr>
-          <w:p>
-            <w:r>
-              <w:rPr>
-                <w:sz w:val="18"/>
-              </w:rPr>
-              <w:t>Outlet POS — Branch Operations</w:t>
-            </w:r>
-          </w:p>
-        </w:tc>
-        <w:tc>
-          <w:tcPr>
-            <w:tcW w:type="dxa" w:w="2448"/>
-          </w:tcPr>
-          <w:p>
-            <w:r>
-              <w:rPr>
-                <w:sz w:val="18"/>
-              </w:rPr>
-              <w:t>3</w:t>
-            </w:r>
-          </w:p>
-        </w:tc>
-        <w:tc>
-          <w:tcPr>
-            <w:tcW w:type="dxa" w:w="2448"/>
-          </w:tcPr>
-          <w:p>
-            <w:r>
-              <w:rPr>
-                <w:sz w:val="18"/>
-              </w:rPr>
-              <w:t>30,000</w:t>
-            </w:r>
-          </w:p>
-        </w:tc>
-        <w:tc>
-          <w:tcPr>
-            <w:tcW w:type="dxa" w:w="2448"/>
-          </w:tcPr>
-          <w:p>
-            <w:r>
-              <w:rPr>
-                <w:sz w:val="18"/>
-              </w:rPr>
-              <w:t>90,000</w:t>
-            </w:r>
-          </w:p>
-        </w:tc>
-      </w:tr>
-      <w:tr>
-        <w:tc>
-          <w:tcPr>
-            <w:tcW w:type="dxa" w:w="2448"/>
-          </w:tcPr>
-          <w:p>
-            <w:r>
-              <w:rPr>
-                <w:sz w:val="18"/>
-              </w:rPr>
-              <w:t>Packing Store, Dispatch &amp; Gatepass</w:t>
-            </w:r>
-          </w:p>
-        </w:tc>
-        <w:tc>
-          <w:tcPr>
-            <w:tcW w:type="dxa" w:w="2448"/>
-          </w:tcPr>
-          <w:p>
-            <w:r>
-              <w:rPr>
-                <w:sz w:val="18"/>
-              </w:rPr>
-              <w:t>1</w:t>
-            </w:r>
-          </w:p>
-        </w:tc>
-        <w:tc>
-          <w:tcPr>
-            <w:tcW w:type="dxa" w:w="2448"/>
-          </w:tcPr>
-          <w:p>
-            <w:r>
-              <w:rPr>
-                <w:sz w:val="18"/>
-              </w:rPr>
-              <w:t>55,000</w:t>
-            </w:r>
-          </w:p>
-        </w:tc>
-        <w:tc>
-          <w:tcPr>
-            <w:tcW w:type="dxa" w:w="2448"/>
-          </w:tcPr>
-          <w:p>
-            <w:r>
-              <w:rPr>
-                <w:sz w:val="18"/>
-              </w:rPr>
-              <w:t>55,000</w:t>
-            </w:r>
-          </w:p>
-        </w:tc>
-      </w:tr>
-      <w:tr>
-        <w:tc>
-          <w:tcPr>
-            <w:tcW w:type="dxa" w:w="2448"/>
-          </w:tcPr>
-          <w:p>
-            <w:r>
-              <w:rPr>
-                <w:sz w:val="18"/>
-              </w:rPr>
-              <w:t>E-Commerce &amp; Courier Integration</w:t>
-            </w:r>
-          </w:p>
-        </w:tc>
-        <w:tc>
-          <w:tcPr>
-            <w:tcW w:type="dxa" w:w="2448"/>
-          </w:tcPr>
-          <w:p>
-            <w:r>
-              <w:rPr>
-                <w:sz w:val="18"/>
-              </w:rPr>
-              <w:t>1</w:t>
-            </w:r>
-          </w:p>
-        </w:tc>
-        <w:tc>
-          <w:tcPr>
-            <w:tcW w:type="dxa" w:w="2448"/>
-          </w:tcPr>
-          <w:p>
-            <w:r>
-              <w:rPr>
-                <w:sz w:val="18"/>
-              </w:rPr>
-              <w:t>70,000</w:t>
-            </w:r>
-          </w:p>
-        </w:tc>
-        <w:tc>
-          <w:tcPr>
-            <w:tcW w:type="dxa" w:w="2448"/>
-          </w:tcPr>
-          <w:p>
-            <w:r>
-              <w:rPr>
-                <w:sz w:val="18"/>
-              </w:rPr>
-              <w:t>70,000</w:t>
-            </w:r>
-          </w:p>
-        </w:tc>
-      </w:tr>
-      <w:tr>
-        <w:tc>
-          <w:tcPr>
-            <w:tcW w:type="dxa" w:w="2448"/>
-          </w:tcPr>
-          <w:p>
-            <w:r>
-              <w:rPr>
-                <w:sz w:val="18"/>
-              </w:rPr>
-              <w:t>Reports, Dashboards &amp; Management Analytics</w:t>
-            </w:r>
-          </w:p>
-        </w:tc>
-        <w:tc>
-          <w:tcPr>
-            <w:tcW w:type="dxa" w:w="2448"/>
-          </w:tcPr>
-          <w:p>
-            <w:r>
-              <w:rPr>
-                <w:sz w:val="18"/>
-              </w:rPr>
-              <w:t>1</w:t>
-            </w:r>
-          </w:p>
-        </w:tc>
-        <w:tc>
-          <w:tcPr>
-            <w:tcW w:type="dxa" w:w="2448"/>
-          </w:tcPr>
-          <w:p>
-            <w:r>
-              <w:rPr>
-                <w:sz w:val="18"/>
-              </w:rPr>
-              <w:t>Included</w:t>
-            </w:r>
-          </w:p>
-        </w:tc>
-        <w:tc>
-          <w:tcPr>
-            <w:tcW w:type="dxa" w:w="2448"/>
-          </w:tcPr>
-          <w:p>
-            <w:r>
-              <w:rPr>
-                <w:sz w:val="18"/>
-              </w:rPr>
-              <w:t>—</w:t>
-            </w:r>
-          </w:p>
-        </w:tc>
-      </w:tr>
-      <w:tr>
-        <w:tc>
-          <w:tcPr>
-            <w:tcW w:type="dxa" w:w="2448"/>
-          </w:tcPr>
-          <w:p>
-            <w:r>
-              <w:rPr>
-                <w:sz w:val="18"/>
-              </w:rPr>
-              <w:t>Data Migration &amp; Opening Balances</w:t>
-            </w:r>
-          </w:p>
-        </w:tc>
-        <w:tc>
-          <w:tcPr>
-            <w:tcW w:type="dxa" w:w="2448"/>
-          </w:tcPr>
-          <w:p>
-            <w:r>
-              <w:rPr>
-                <w:sz w:val="18"/>
-              </w:rPr>
-              <w:t>1</w:t>
-            </w:r>
-          </w:p>
-        </w:tc>
-        <w:tc>
-          <w:tcPr>
-            <w:tcW w:type="dxa" w:w="2448"/>
-          </w:tcPr>
-          <w:p>
-            <w:r>
-              <w:rPr>
-                <w:sz w:val="18"/>
-              </w:rPr>
-              <w:t>Included</w:t>
-            </w:r>
-          </w:p>
-        </w:tc>
-        <w:tc>
-          <w:tcPr>
-            <w:tcW w:type="dxa" w:w="2448"/>
-          </w:tcPr>
-          <w:p>
-            <w:r>
-              <w:rPr>
-                <w:sz w:val="18"/>
-              </w:rPr>
-              <w:t>—</w:t>
-            </w:r>
-          </w:p>
-        </w:tc>
-      </w:tr>
-      <w:tr>
-        <w:tc>
-          <w:tcPr>
-            <w:tcW w:type="dxa" w:w="2448"/>
-          </w:tcPr>
-          <w:p>
-            <w:r>
-              <w:rPr>
-                <w:sz w:val="18"/>
-              </w:rPr>
-              <w:t>On-Site Training, UAT &amp; Go-Live Support</w:t>
-            </w:r>
-          </w:p>
-        </w:tc>
-        <w:tc>
-          <w:tcPr>
-            <w:tcW w:type="dxa" w:w="2448"/>
-          </w:tcPr>
-          <w:p>
-            <w:r>
-              <w:rPr>
-                <w:sz w:val="18"/>
-              </w:rPr>
-              <w:t>1</w:t>
-            </w:r>
-          </w:p>
-        </w:tc>
-        <w:tc>
-          <w:tcPr>
-            <w:tcW w:type="dxa" w:w="2448"/>
-          </w:tcPr>
-          <w:p>
-            <w:r>
-              <w:rPr>
-                <w:sz w:val="18"/>
-              </w:rPr>
-              <w:t>Included</w:t>
-            </w:r>
-          </w:p>
-        </w:tc>
-        <w:tc>
-          <w:tcPr>
-            <w:tcW w:type="dxa" w:w="2448"/>
-          </w:tcPr>
-          <w:p>
-            <w:r>
-              <w:rPr>
-                <w:sz w:val="18"/>
-              </w:rPr>
-              <w:t>—</w:t>
-            </w:r>
-          </w:p>
-        </w:tc>
-      </w:tr>
-      <w:tr>
-        <w:tc>
-          <w:tcPr>
-            <w:tcW w:type="dxa" w:w="2448"/>
+            <w:tcW w:type="dxa" w:w="4896"/>
             <w:shd w:fill="E2E8F0" w:val="clear"/>
           </w:tcPr>
           <w:p>
@@ -2657,41 +1978,13 @@
                 <w:b/>
                 <w:sz w:val="22"/>
               </w:rPr>
-              <w:t>TOTAL ONE-TIME IMPLEMENTATION</w:t>
+              <w:t>Complete ERP Implementation — all modules, 3 outlet branches, integrations, data migration, training, UAT, and go-live support</w:t>
             </w:r>
           </w:p>
         </w:tc>
         <w:tc>
           <w:tcPr>
-            <w:tcW w:type="dxa" w:w="2448"/>
-            <w:shd w:fill="E2E8F0" w:val="clear"/>
-          </w:tcPr>
-          <w:p>
-            <w:r>
-              <w:rPr>
-                <w:b/>
-                <w:sz w:val="22"/>
-              </w:rPr>
-            </w:r>
-          </w:p>
-        </w:tc>
-        <w:tc>
-          <w:tcPr>
-            <w:tcW w:type="dxa" w:w="2448"/>
-            <w:shd w:fill="E2E8F0" w:val="clear"/>
-          </w:tcPr>
-          <w:p>
-            <w:r>
-              <w:rPr>
-                <w:b/>
-                <w:sz w:val="22"/>
-              </w:rPr>
-            </w:r>
-          </w:p>
-        </w:tc>
-        <w:tc>
-          <w:tcPr>
-            <w:tcW w:type="dxa" w:w="2448"/>
+            <w:tcW w:type="dxa" w:w="4896"/>
             <w:shd w:fill="E2E8F0" w:val="clear"/>
           </w:tcPr>
           <w:p>
@@ -2706,6 +1999,103 @@
         </w:tc>
       </w:tr>
     </w:tbl>
+    <w:p/>
+    <w:p>
+      <w:r>
+        <w:rPr>
+          <w:b/>
+        </w:rPr>
+        <w:t>This investment includes:</w:t>
+      </w:r>
+    </w:p>
+    <w:p>
+      <w:pPr>
+        <w:pStyle w:val="ListBullet"/>
+      </w:pPr>
+      <w:r>
+        <w:t>Core platform with users, roles, security, and approval workflows</w:t>
+      </w:r>
+    </w:p>
+    <w:p>
+      <w:pPr>
+        <w:pStyle w:val="ListBullet"/>
+      </w:pPr>
+      <w:r>
+        <w:t>HR, attendance, and payroll management</w:t>
+      </w:r>
+    </w:p>
+    <w:p>
+      <w:pPr>
+        <w:pStyle w:val="ListBullet"/>
+      </w:pPr>
+      <w:r>
+        <w:t>Purchase, procurement, and supplier management</w:t>
+      </w:r>
+    </w:p>
+    <w:p>
+      <w:pPr>
+        <w:pStyle w:val="ListBullet"/>
+      </w:pPr>
+      <w:r>
+        <w:t>Inventory, warehouse, and stock control</w:t>
+      </w:r>
+    </w:p>
+    <w:p>
+      <w:pPr>
+        <w:pStyle w:val="ListBullet"/>
+      </w:pPr>
+      <w:r>
+        <w:t>Production and manufacturing (Job Card, embroidery, workflow, costing, dashboard)</w:t>
+      </w:r>
+    </w:p>
+    <w:p>
+      <w:pPr>
+        <w:pStyle w:val="ListBullet"/>
+      </w:pPr>
+      <w:r>
+        <w:t>Accounts, finance, and department-wise reconciliation</w:t>
+      </w:r>
+    </w:p>
+    <w:p>
+      <w:pPr>
+        <w:pStyle w:val="ListBullet"/>
+      </w:pPr>
+      <w:r>
+        <w:t>Outlet POS for 3 branches</w:t>
+      </w:r>
+    </w:p>
+    <w:p>
+      <w:pPr>
+        <w:pStyle w:val="ListBullet"/>
+      </w:pPr>
+      <w:r>
+        <w:t>Packing store, dispatch, and gatepass management</w:t>
+      </w:r>
+    </w:p>
+    <w:p>
+      <w:pPr>
+        <w:pStyle w:val="ListBullet"/>
+      </w:pPr>
+      <w:r>
+        <w:t>E-commerce and courier integration</w:t>
+      </w:r>
+    </w:p>
+    <w:p>
+      <w:pPr>
+        <w:pStyle w:val="ListBullet"/>
+      </w:pPr>
+      <w:r>
+        <w:t>Reports, dashboards, and management analytics</w:t>
+      </w:r>
+    </w:p>
+    <w:p>
+      <w:pPr>
+        <w:pStyle w:val="ListBullet"/>
+      </w:pPr>
+      <w:r>
+        <w:t>Data migration, opening balances, on-site training, UAT, and go-live support</w:t>
+      </w:r>
+    </w:p>
     <w:p/>
     <w:p>
       <w:r>

</xml_diff>